<commit_message>
manuscript: reflect sigma-kernel fix (D-16) via full re-derivation
Rederive all downstream results after switching sigma GP to full-ARD
kernel with log-sigma (D-16, reflection complete). Measured accuracy:
read 3.98 mV, write 5.65 mV (N020e). Core changes:

- Retire MC 5000->500 lossless claim (new sigma model uses MC depth;
  10x cut now costs ~2.7 mV, knee near n'=1000)
- Fix write-sigma bottleneck claim (was tied to 0.4 V; now improves)
- Corner RMSE read/write now 8.5/5.8 (was 9.3/16.7); write corner is
  no longer harder than read in the same way
- Route v_e_inverse.py sigma reads through Surrogate.predict_mean();
  assert-guard legacy .pth loading via sigma_model marker
- Snapshot cost results at MC 1000 (cost_combined_c400_mc1000,
  cost_combined_write_c400_mc1000) alongside MC 500

paper_*.md seven variants still carry old numbers; valid manuscript is
SRAM_Vmin_IEEE[_KR].docx built from results/.
</commit_message>
<xml_diff>
--- a/manuscript/SRAM_Vmin_IEEE.docx
+++ b/manuscript/SRAM_Vmin_IEEE.docx
@@ -6478,7 +6478,7 @@
           <w:sz w:val="20"/>
           <w:szCs w:val="20"/>
         </w:rPr>
-        <w:t xml:space="preserve">The budget itself is a design variable, and its price is measurable. Cutting the number of conditions, the supply levels, and the MC depth together reduces the campaign by 53× for read and 42.5× for write, at a cost of +7.0 mV and +10.2 mV in V</w:t>
+        <w:t xml:space="preserve">The budget itself is a design variable, and its price is measurable. Cutting the number of conditions, the supply levels, and the MC depth together reduces the campaign by 53× for read and 42.5× for write, at a cost of +3.5 mV and +2.8 mV in V</w:t>
       </w:r>
       <w:r>
         <w:rPr>
@@ -6788,7 +6788,7 @@
                 <w:sz w:val="16"/>
                 <w:szCs w:val="16"/>
               </w:rPr>
-              <w:t xml:space="preserve">10.95 mV</w:t>
+              <w:t xml:space="preserve">7.51 mV</w:t>
             </w:r>
           </w:p>
         </w:tc>
@@ -6815,7 +6815,7 @@
                 <w:sz w:val="16"/>
                 <w:szCs w:val="16"/>
               </w:rPr>
-              <w:t xml:space="preserve">15.83 mV</w:t>
+              <w:t xml:space="preserve">8.46 mV</w:t>
             </w:r>
           </w:p>
         </w:tc>
@@ -6975,7 +6975,7 @@
                 <w:sz w:val="16"/>
                 <w:szCs w:val="16"/>
               </w:rPr>
-              <w:t xml:space="preserve">+7.0 mV</w:t>
+              <w:t xml:space="preserve">+3.5 mV</w:t>
             </w:r>
           </w:p>
         </w:tc>
@@ -7002,7 +7002,7 @@
                 <w:sz w:val="16"/>
                 <w:szCs w:val="16"/>
               </w:rPr>
-              <w:t xml:space="preserve">+10.2 mV</w:t>
+              <w:t xml:space="preserve">+2.8 mV</w:t>
             </w:r>
           </w:p>
         </w:tc>
@@ -7107,7 +7107,7 @@
           <w:sz w:val="16"/>
           <w:szCs w:val="16"/>
         </w:rPr>
-        <w:t xml:space="preserve">  Budget-reduction trade-off: (a) number of process conditions, (b) MC depth per condition, (c) one factor cut alone against all three cut together. The combined 53× reduction costs +7.0 mV of read V</w:t>
+        <w:t xml:space="preserve">  Budget-reduction trade-off: (a) number of process conditions, (b) MC depth per condition, (c) one factor cut alone against all three cut together. The combined 53× reduction costs +3.5 mV of read V</w:t>
       </w:r>
       <w:r>
         <w:rPr>

</xml_diff>